<commit_message>
Day 1: Notes updated
</commit_message>
<xml_diff>
--- a/notes/Interview Questions.docx
+++ b/notes/Interview Questions.docx
@@ -432,16 +432,7 @@
           <w:sz w:val="24"/>
           <w:szCs w:val="24"/>
         </w:rPr>
-        <w:t xml:space="preserve">A virtual environment is an isolated Python environment created for a specific project. It allows each project to have its own dependencies and package versions without affecting other projects or the system Python installation. I created </w:t>
-      </w:r>
-      <w:proofErr w:type="gramStart"/>
-      <w:r>
-        <w:rPr>
-          <w:rFonts w:ascii="Aptos" w:hAnsi="Aptos"/>
-          <w:sz w:val="24"/>
-          <w:szCs w:val="24"/>
-        </w:rPr>
-        <w:t>a .</w:t>
+        <w:t>A virtual environment is an isolated Python environment created for a specific project. It allows each project to have its own dependencies and package versions without affecting other projects or the system Python installation. I created a .</w:t>
       </w:r>
       <w:proofErr w:type="spellStart"/>
       <w:r>
@@ -453,7 +444,6 @@
         <w:t>venv</w:t>
       </w:r>
       <w:proofErr w:type="spellEnd"/>
-      <w:proofErr w:type="gramEnd"/>
       <w:r>
         <w:rPr>
           <w:rFonts w:ascii="Aptos" w:hAnsi="Aptos"/>
@@ -500,18 +490,7 @@
           <w:sz w:val="24"/>
           <w:szCs w:val="24"/>
         </w:rPr>
-        <w:t xml:space="preserve">7. Why do we </w:t>
-      </w:r>
-      <w:proofErr w:type="gramStart"/>
-      <w:r>
-        <w:rPr>
-          <w:rFonts w:ascii="Aptos" w:hAnsi="Aptos"/>
-          <w:b/>
-          <w:bCs/>
-          <w:sz w:val="24"/>
-          <w:szCs w:val="24"/>
-        </w:rPr>
-        <w:t>use .</w:t>
+        <w:t>7. Why do we use .</w:t>
       </w:r>
       <w:proofErr w:type="spellStart"/>
       <w:r>
@@ -525,7 +504,6 @@
         <w:t>gitignore</w:t>
       </w:r>
       <w:proofErr w:type="spellEnd"/>
-      <w:proofErr w:type="gramEnd"/>
       <w:r>
         <w:rPr>
           <w:rFonts w:ascii="Aptos" w:hAnsi="Aptos"/>
@@ -545,7 +523,6 @@
           <w:szCs w:val="24"/>
         </w:rPr>
       </w:pPr>
-      <w:proofErr w:type="gramStart"/>
       <w:r>
         <w:rPr>
           <w:rFonts w:ascii="Aptos" w:hAnsi="Aptos"/>
@@ -564,7 +541,6 @@
         <w:t>gitignore</w:t>
       </w:r>
       <w:proofErr w:type="spellEnd"/>
-      <w:proofErr w:type="gramEnd"/>
       <w:r>
         <w:rPr>
           <w:rFonts w:ascii="Aptos" w:hAnsi="Aptos"/>
@@ -817,16 +793,7 @@
           <w:sz w:val="24"/>
           <w:szCs w:val="24"/>
         </w:rPr>
-        <w:t>generate_</w:t>
-      </w:r>
-      <w:proofErr w:type="gramStart"/>
-      <w:r>
-        <w:rPr>
-          <w:rFonts w:ascii="Aptos" w:hAnsi="Aptos"/>
-          <w:sz w:val="24"/>
-          <w:szCs w:val="24"/>
-        </w:rPr>
-        <w:t>content</w:t>
+        <w:t>generate_content</w:t>
       </w:r>
       <w:proofErr w:type="spellEnd"/>
       <w:r>
@@ -835,16 +802,7 @@
           <w:sz w:val="24"/>
           <w:szCs w:val="24"/>
         </w:rPr>
-        <w:t>(</w:t>
-      </w:r>
-      <w:proofErr w:type="gramEnd"/>
-      <w:r>
-        <w:rPr>
-          <w:rFonts w:ascii="Aptos" w:hAnsi="Aptos"/>
-          <w:sz w:val="24"/>
-          <w:szCs w:val="24"/>
-        </w:rPr>
-        <w:t>) to send prompts and receive responses in a simpler and more Pythonic way.</w:t>
+        <w:t>() to send prompts and receive responses in a simpler and more Pythonic way.</w:t>
       </w:r>
     </w:p>
     <w:p>
@@ -902,16 +860,7 @@
           <w:sz w:val="24"/>
           <w:szCs w:val="24"/>
         </w:rPr>
-        <w:t>load_</w:t>
-      </w:r>
-      <w:proofErr w:type="gramStart"/>
-      <w:r>
-        <w:rPr>
-          <w:rFonts w:ascii="Aptos" w:hAnsi="Aptos"/>
-          <w:sz w:val="24"/>
-          <w:szCs w:val="24"/>
-        </w:rPr>
-        <w:t>dotenv</w:t>
+        <w:t>load_dotenv</w:t>
       </w:r>
       <w:proofErr w:type="spellEnd"/>
       <w:r>
@@ -920,16 +869,7 @@
           <w:sz w:val="24"/>
           <w:szCs w:val="24"/>
         </w:rPr>
-        <w:t>(</w:t>
-      </w:r>
-      <w:proofErr w:type="gramEnd"/>
-      <w:r>
-        <w:rPr>
-          <w:rFonts w:ascii="Aptos" w:hAnsi="Aptos"/>
-          <w:sz w:val="24"/>
-          <w:szCs w:val="24"/>
-        </w:rPr>
-        <w:t>)</w:t>
+        <w:t>()</w:t>
       </w:r>
       <w:r>
         <w:rPr>
@@ -958,7 +898,6 @@
         <w:t xml:space="preserve"> = </w:t>
       </w:r>
       <w:proofErr w:type="spellStart"/>
-      <w:proofErr w:type="gramStart"/>
       <w:r>
         <w:rPr>
           <w:rFonts w:ascii="Aptos" w:hAnsi="Aptos"/>
@@ -968,7 +907,6 @@
         <w:t>os.getenv</w:t>
       </w:r>
       <w:proofErr w:type="spellEnd"/>
-      <w:proofErr w:type="gramEnd"/>
       <w:r>
         <w:rPr>
           <w:rFonts w:ascii="Aptos" w:hAnsi="Aptos"/>
@@ -993,16 +931,7 @@
           <w:sz w:val="24"/>
           <w:szCs w:val="24"/>
         </w:rPr>
-        <w:t>load_</w:t>
-      </w:r>
-      <w:proofErr w:type="gramStart"/>
-      <w:r>
-        <w:rPr>
-          <w:rFonts w:ascii="Aptos" w:hAnsi="Aptos"/>
-          <w:sz w:val="24"/>
-          <w:szCs w:val="24"/>
-        </w:rPr>
-        <w:t>dotenv</w:t>
+        <w:t>load_dotenv</w:t>
       </w:r>
       <w:proofErr w:type="spellEnd"/>
       <w:r>
@@ -1011,19 +940,9 @@
           <w:sz w:val="24"/>
           <w:szCs w:val="24"/>
         </w:rPr>
-        <w:t>(</w:t>
-      </w:r>
-      <w:proofErr w:type="gramEnd"/>
-      <w:r>
-        <w:rPr>
-          <w:rFonts w:ascii="Aptos" w:hAnsi="Aptos"/>
-          <w:sz w:val="24"/>
-          <w:szCs w:val="24"/>
-        </w:rPr>
-        <w:t xml:space="preserve">) loads the environment variables from the .env file into the application's environment. Then </w:t>
+        <w:t xml:space="preserve">() loads the environment variables from the .env file into the application's environment. Then </w:t>
       </w:r>
       <w:proofErr w:type="spellStart"/>
-      <w:proofErr w:type="gramStart"/>
       <w:r>
         <w:rPr>
           <w:rFonts w:ascii="Aptos" w:hAnsi="Aptos"/>
@@ -1033,7 +952,6 @@
         <w:t>os.getenv</w:t>
       </w:r>
       <w:proofErr w:type="spellEnd"/>
-      <w:proofErr w:type="gramEnd"/>
       <w:r>
         <w:rPr>
           <w:rFonts w:ascii="Aptos" w:hAnsi="Aptos"/>
@@ -1665,6 +1583,41 @@
         </w:rPr>
         <w:t xml:space="preserve"> without modifying the model itself.</w:t>
       </w:r>
+    </w:p>
+    <w:p>
+      <w:pPr>
+        <w:rPr>
+          <w:rFonts w:ascii="Aptos" w:hAnsi="Aptos"/>
+          <w:sz w:val="24"/>
+          <w:szCs w:val="24"/>
+        </w:rPr>
+      </w:pPr>
+    </w:p>
+    <w:p>
+      <w:pPr>
+        <w:rPr>
+          <w:rFonts w:ascii="Aptos" w:hAnsi="Aptos"/>
+          <w:sz w:val="24"/>
+          <w:szCs w:val="24"/>
+        </w:rPr>
+      </w:pPr>
+      <w:r>
+        <w:rPr>
+          <w:rFonts w:ascii="Aptos" w:hAnsi="Aptos"/>
+          <w:sz w:val="24"/>
+          <w:szCs w:val="24"/>
+        </w:rPr>
+        <w:t>DAY 2</w:t>
+      </w:r>
+    </w:p>
+    <w:p>
+      <w:pPr>
+        <w:rPr>
+          <w:rFonts w:ascii="Aptos" w:hAnsi="Aptos"/>
+          <w:sz w:val="24"/>
+          <w:szCs w:val="24"/>
+        </w:rPr>
+      </w:pPr>
     </w:p>
     <w:p>
       <w:pPr>

</xml_diff>